<commit_message>
docs: align product naming to CareMate and tidy repo layout
- rename the product in every live doc, in the resume (md/html/docx) and in the
  FastAPI title; the one remaining "Smart Health Assistant" is the README link to
  the upstream project this one started from
- fix the bilingual anchor links in docs/rag.md and docs/skills.md, which would
  break once the headings changed
- move project notes out of the repo root (log.md, todo.md and
  pc_ai_setup_manual.md into docs/) and dev scripts into scripts/
- replace machine-specific paths in docs/pc_ai_setup_manual.md with placeholders
  consistent with the USER@GPU_HOST style already used in that file
- update the intent vocabulary in product-spec, the project overview and the
  interview notes to match the three-class gate
</commit_message>
<xml_diff>
--- a/docs/project-resume-agent-intern.docx
+++ b/docs/project-resume-agent-intern.docx
@@ -8,7 +8,7 @@
           <w:rFonts w:eastAsia="Microsoft YaHei"/>
           <w:sz w:val="22"/>
         </w:rPr>
-        <w:t xml:space="preserve">Smart Health Assistant | Agent Platform Project Resume</w:t>
+        <w:t xml:space="preserve">CareMate | Agent Platform Project Resume</w:t>
       </w:r>
     </w:p>
     <w:p>
@@ -44,7 +44,7 @@
           <w:rFonts w:eastAsia="Microsoft YaHei"/>
           <w:sz w:val="22"/>
         </w:rPr>
-        <w:t xml:space="preserve">Supervisor 意图识别：设计 `emergency / pure_chat / mixed / health` 四类 Intent Gate，结合确定性急症规则和结构化 Schema 校验，避免普通问答覆盖高风险信号；支持复合请求提取和领域 Agent 路由。</w:t>
+        <w:t xml:space="preserve">Supervisor 意图识别：设计 `chat / health / emergency` 三类 Intent Gate，按"健康优先"判定（只要出现健康诉求即归 `health`），结合确定性急症规则和结构化 Schema 校验，避免普通问答覆盖高风险信号；支持复合请求提取和领域 Agent 路由。</w:t>
       </w:r>
     </w:p>
     <w:p>
@@ -80,16 +80,16 @@
           <w:rFonts w:eastAsia="Microsoft YaHei"/>
           <w:sz w:val="22"/>
         </w:rPr>
-        <w:t xml:space="preserve">RAG 检索链路：实现 BM25 + Dense 召回、RRF 融合、MMR 去重重排、父子块聚合和来源注入；知识覆盖中文医学资料、检验参考范围、药品相互作用和医保政策。</w:t>
-      </w:r>
-    </w:p>
-    <w:p>
-      <w:r>
-        <w:rPr>
-          <w:rFonts w:eastAsia="Microsoft YaHei"/>
-          <w:sz w:val="22"/>
-        </w:rPr>
-        <w:t xml:space="preserve">检索评测：在来源级查询集上记录 Recall@1 48%、Recall@3 77%、Recall@5 79%、MRR 0.626、平均延迟约 114ms，并明确区分来源定位指标与医学答案正确率。</w:t>
+        <w:t xml:space="preserve">Agentic RAG 检索链路：实现 BM25 + Dense 召回、RRF 融合、MMR 去重重排、父子块聚合和来源注入；新增有界多轮检索控制器，第一轮观察证据缺口后生成面向适应症、风险、流程等缺口的下一轮查询，直到证据充分或达到预算。</w:t>
+      </w:r>
+    </w:p>
+    <w:p>
+      <w:r>
+        <w:rPr>
+          <w:rFonts w:eastAsia="Microsoft YaHei"/>
+          <w:sz w:val="22"/>
+        </w:rPr>
+        <w:t xml:space="preserve">检索评测：在 100 条 Agentic RAG A/B 场景集上，普通 RAG 的 Source Recall@1/3/5 为 88%/92%/96%，Agentic RAG 为 90%/93%/93%；章节 Recall@3 从 35% 提升至 52%，MRR 从 0.3155 提升至 0.4995；明确区分来源定位、章节命中与医学答案正确率。</w:t>
       </w:r>
     </w:p>
     <w:p>
@@ -125,6 +125,15 @@
           <w:rFonts w:eastAsia="Microsoft YaHei"/>
           <w:sz w:val="22"/>
         </w:rPr>
+        <w:t xml:space="preserve">用户级 Memory Evolution：实现 Shadow Memory Agent，显式偏好即时提取、普通对话每 10 轮触发维护，基于 `MemoryCandidate/HealthEvent` 生成可审计的 Hermes 风格 Markdown 记忆投影，并提供独立 reset，不影响医疗安全规则和历史审计数据。</w:t>
+      </w:r>
+    </w:p>
+    <w:p>
+      <w:r>
+        <w:rPr>
+          <w:rFonts w:eastAsia="Microsoft YaHei"/>
+          <w:sz w:val="22"/>
+        </w:rPr>
         <w:t xml:space="preserve">工程化自进化：构建 ExperienceRecord → FailureCase → SkillProposal → 冻结评测集 → baseline/candidate 对照 → 安全门禁 → 人工审核 → SkillDeployment 闭环。</w:t>
       </w:r>
     </w:p>
@@ -152,7 +161,16 @@
           <w:rFonts w:eastAsia="Microsoft YaHei"/>
           <w:sz w:val="22"/>
         </w:rPr>
-        <w:t xml:space="preserve">用户提出“近三个月血压升高，想吃降压药，还想知道医保能否报销”。系统识别 mixed health intent，拆分趋势分析、科普检索和医保事务任务；并行执行无依赖任务；Verifier 检查证据、安全和逻辑一致性；缺信息时只补充局部任务；最终按健康风险、用药边界和医保政策聚合回答。</w:t>
+        <w:t xml:space="preserve">端到端评测与质量诊断：合并 28 条在线补测样本与 72 条扩展预算补测样本，形成完整 100 条合成回归口径：任务完成率 97.0%、路由准确率 80.0%，平均延迟 19.9 秒、P95 49.5 秒；对全部 100 条引入 DeepSeek LLM-as-Judge，结构化输出遵循率 97.0%，有效样本计划质量均分 0.849、回答完整性均分 0.829。结果未经人工校准，不能解读为临床结论。</w:t>
+      </w:r>
+    </w:p>
+    <w:p>
+      <w:r>
+        <w:rPr>
+          <w:rFonts w:eastAsia="Microsoft YaHei"/>
+          <w:sz w:val="22"/>
+        </w:rPr>
+        <w:t xml:space="preserve">用户提出“近三个月血压升高，想吃降压药，还想知道医保能否报销”。系统按健康优先判为 `health`，planner 拆成趋势分析、科普检索和医保事务三个任务；并行执行无依赖任务；Verifier 检查证据、安全和逻辑一致性；缺信息时只补充局部任务；最终按健康风险、用药边界和医保政策聚合回答。</w:t>
       </w:r>
     </w:p>
     <w:p>

</xml_diff>